<commit_message>
feat: optimize sessions, fix SPA back navigation, enhance chatbot UI, and improve RAG indexing
</commit_message>
<xml_diff>
--- a/public/resume/Sumit_Kumar_GenAI_Full_Stack.docx
+++ b/public/resume/Sumit_Kumar_GenAI_Full_Stack.docx
@@ -1,6 +1,6 @@
 
 <file path=word/document.xml><?xml version="1.0" encoding="utf-8"?>
-<w:document xmlns:wpc="http://schemas.microsoft.com/office/word/2010/wordprocessingCanvas" xmlns:cx="http://schemas.microsoft.com/office/drawing/2014/chartex" xmlns:cx1="http://schemas.microsoft.com/office/drawing/2015/9/8/chartex" xmlns:cx2="http://schemas.microsoft.com/office/drawing/2015/10/21/chartex" xmlns:cx3="http://schemas.microsoft.com/office/drawing/2016/5/9/chartex" xmlns:cx4="http://schemas.microsoft.com/office/drawing/2016/5/10/chartex" xmlns:cx5="http://schemas.microsoft.com/office/drawing/2016/5/11/chartex" xmlns:cx6="http://schemas.microsoft.com/office/drawing/2016/5/12/chartex" xmlns:cx7="http://schemas.microsoft.com/office/drawing/2016/5/13/chartex" xmlns:cx8="http://schemas.microsoft.com/office/drawing/2016/5/14/chartex" xmlns:mc="http://schemas.openxmlformats.org/markup-compatibility/2006" xmlns:aink="http://schemas.microsoft.com/office/drawing/2016/ink" xmlns:am3d="http://schemas.microsoft.com/office/drawing/2017/model3d" xmlns:o="urn:schemas-microsoft-com:office:office" xmlns:r="http://schemas.openxmlformats.org/officeDocument/2006/relationships" xmlns:m="http://schemas.openxmlformats.org/officeDocument/2006/math" xmlns:v="urn:schemas-microsoft-com:vml" xmlns:wp14="http://schemas.microsoft.com/office/word/2010/wordprocessingDrawing" xmlns:wp="http://schemas.openxmlformats.org/drawingml/2006/wordprocessingDrawing" xmlns:w10="urn:schemas-microsoft-com:office:word" xmlns:w="http://schemas.openxmlformats.org/wordprocessingml/2006/main" xmlns:w14="http://schemas.microsoft.com/office/word/2010/wordml" xmlns:w15="http://schemas.microsoft.com/office/word/2012/wordml" xmlns:w16cex="http://schemas.microsoft.com/office/word/2018/wordml/cex" xmlns:w16cid="http://schemas.microsoft.com/office/word/2016/wordml/cid" xmlns:w16="http://schemas.microsoft.com/office/word/2018/wordml" xmlns:w16sdtdh="http://schemas.microsoft.com/office/word/2020/wordml/sdtdatahash" xmlns:w16se="http://schemas.microsoft.com/office/word/2015/wordml/symex" xmlns:wpg="http://schemas.microsoft.com/office/word/2010/wordprocessingGroup" xmlns:wpi="http://schemas.microsoft.com/office/word/2010/wordprocessingInk" xmlns:wne="http://schemas.microsoft.com/office/word/2006/wordml" xmlns:wps="http://schemas.microsoft.com/office/word/2010/wordprocessingShape" mc:Ignorable="w14 w15 w16se w16cid w16 w16cex w16sdtdh wp14">
+<w:document xmlns:wpc="http://schemas.microsoft.com/office/word/2010/wordprocessingCanvas" xmlns:cx="http://schemas.microsoft.com/office/drawing/2014/chartex" xmlns:cx1="http://schemas.microsoft.com/office/drawing/2015/9/8/chartex" xmlns:cx2="http://schemas.microsoft.com/office/drawing/2015/10/21/chartex" xmlns:cx3="http://schemas.microsoft.com/office/drawing/2016/5/9/chartex" xmlns:cx4="http://schemas.microsoft.com/office/drawing/2016/5/10/chartex" xmlns:cx5="http://schemas.microsoft.com/office/drawing/2016/5/11/chartex" xmlns:cx6="http://schemas.microsoft.com/office/drawing/2016/5/12/chartex" xmlns:cx7="http://schemas.microsoft.com/office/drawing/2016/5/13/chartex" xmlns:cx8="http://schemas.microsoft.com/office/drawing/2016/5/14/chartex" xmlns:mc="http://schemas.openxmlformats.org/markup-compatibility/2006" xmlns:aink="http://schemas.microsoft.com/office/drawing/2016/ink" xmlns:am3d="http://schemas.microsoft.com/office/drawing/2017/model3d" xmlns:o="urn:schemas-microsoft-com:office:office" xmlns:oel="http://schemas.microsoft.com/office/2019/extlst" xmlns:r="http://schemas.openxmlformats.org/officeDocument/2006/relationships" xmlns:m="http://schemas.openxmlformats.org/officeDocument/2006/math" xmlns:v="urn:schemas-microsoft-com:vml" xmlns:wp14="http://schemas.microsoft.com/office/word/2010/wordprocessingDrawing" xmlns:wp="http://schemas.openxmlformats.org/drawingml/2006/wordprocessingDrawing" xmlns:w10="urn:schemas-microsoft-com:office:word" xmlns:w="http://schemas.openxmlformats.org/wordprocessingml/2006/main" xmlns:w14="http://schemas.microsoft.com/office/word/2010/wordml" xmlns:w15="http://schemas.microsoft.com/office/word/2012/wordml" xmlns:w16cex="http://schemas.microsoft.com/office/word/2018/wordml/cex" xmlns:w16cid="http://schemas.microsoft.com/office/word/2016/wordml/cid" xmlns:w16="http://schemas.microsoft.com/office/word/2018/wordml" xmlns:w16du="http://schemas.microsoft.com/office/word/2023/wordml/word16du" xmlns:w16sdtdh="http://schemas.microsoft.com/office/word/2020/wordml/sdtdatahash" xmlns:w16sdtfl="http://schemas.microsoft.com/office/word/2024/wordml/sdtformatlock" xmlns:w16se="http://schemas.microsoft.com/office/word/2015/wordml/symex" xmlns:wpg="http://schemas.microsoft.com/office/word/2010/wordprocessingGroup" xmlns:wpi="http://schemas.microsoft.com/office/word/2010/wordprocessingInk" xmlns:wne="http://schemas.microsoft.com/office/word/2006/wordml" xmlns:wps="http://schemas.microsoft.com/office/word/2010/wordprocessingShape" mc:Ignorable="w14 w15 w16se w16cid w16 w16cex w16sdtdh w16sdtfl w16du wp14">
   <w:body>
     <w:p>
       <w:pPr>
@@ -23,12 +23,14 @@
       <w:r>
         <w:t xml:space="preserve">GenAI &amp; </w:t>
       </w:r>
+      <w:proofErr w:type="gramStart"/>
       <w:r>
         <w:t>M</w:t>
       </w:r>
       <w:r>
         <w:t>ulti-Agent Engineer</w:t>
       </w:r>
+      <w:proofErr w:type="gramEnd"/>
       <w:r>
         <w:t xml:space="preserve"> </w:t>
       </w:r>
@@ -210,15 +212,37 @@
         </w:rPr>
         <w:t xml:space="preserve">, focusing on LLM orchestration, fine-tuning and agentic workflows using </w:t>
       </w:r>
-      <w:r>
-        <w:rPr>
-          <w:b/>
-          <w:bCs/>
-          <w:sz w:val="18"/>
-          <w:szCs w:val="18"/>
-        </w:rPr>
-        <w:t>LangChain and CrewAI</w:t>
-      </w:r>
+      <w:proofErr w:type="spellStart"/>
+      <w:r>
+        <w:rPr>
+          <w:b/>
+          <w:bCs/>
+          <w:sz w:val="18"/>
+          <w:szCs w:val="18"/>
+        </w:rPr>
+        <w:t>LangChain</w:t>
+      </w:r>
+      <w:proofErr w:type="spellEnd"/>
+      <w:r>
+        <w:rPr>
+          <w:b/>
+          <w:bCs/>
+          <w:sz w:val="18"/>
+          <w:szCs w:val="18"/>
+        </w:rPr>
+        <w:t xml:space="preserve"> and </w:t>
+      </w:r>
+      <w:proofErr w:type="spellStart"/>
+      <w:r>
+        <w:rPr>
+          <w:b/>
+          <w:bCs/>
+          <w:sz w:val="18"/>
+          <w:szCs w:val="18"/>
+        </w:rPr>
+        <w:t>CrewAI</w:t>
+      </w:r>
+      <w:proofErr w:type="spellEnd"/>
       <w:r>
         <w:rPr>
           <w:sz w:val="18"/>
@@ -288,6 +312,10 @@
           <w:numId w:val="3"/>
         </w:numPr>
         <w:spacing w:line="240" w:lineRule="auto"/>
+        <w:rPr>
+          <w:sz w:val="18"/>
+          <w:szCs w:val="18"/>
+        </w:rPr>
       </w:pPr>
       <w:r>
         <w:rPr>
@@ -303,7 +331,23 @@
           <w:sz w:val="18"/>
           <w:szCs w:val="18"/>
         </w:rPr>
-        <w:t>RAG Pipelines, Prompt Engineering (Zero-shot/Few-shot/CoT), LLM Fine-Tuning</w:t>
+        <w:t>RAG Pipelines, Prompt Engineering (Zero-shot/Few-shot/</w:t>
+      </w:r>
+      <w:proofErr w:type="spellStart"/>
+      <w:r>
+        <w:rPr>
+          <w:sz w:val="18"/>
+          <w:szCs w:val="18"/>
+        </w:rPr>
+        <w:t>CoT</w:t>
+      </w:r>
+      <w:proofErr w:type="spellEnd"/>
+      <w:r>
+        <w:rPr>
+          <w:sz w:val="18"/>
+          <w:szCs w:val="18"/>
+        </w:rPr>
+        <w:t>), LLM Fine-Tuning</w:t>
       </w:r>
       <w:r>
         <w:rPr>
@@ -335,6 +379,10 @@
           <w:numId w:val="3"/>
         </w:numPr>
         <w:spacing w:line="240" w:lineRule="auto"/>
+        <w:rPr>
+          <w:sz w:val="18"/>
+          <w:szCs w:val="18"/>
+        </w:rPr>
       </w:pPr>
       <w:r>
         <w:rPr>
@@ -350,7 +398,39 @@
           <w:sz w:val="18"/>
           <w:szCs w:val="18"/>
         </w:rPr>
-        <w:t xml:space="preserve">Multi-Agent Systems, LangChain, LlamaIndex, </w:t>
+        <w:t xml:space="preserve">Multi-Agent Systems, </w:t>
+      </w:r>
+      <w:proofErr w:type="spellStart"/>
+      <w:r>
+        <w:rPr>
+          <w:sz w:val="18"/>
+          <w:szCs w:val="18"/>
+        </w:rPr>
+        <w:t>LangChain</w:t>
+      </w:r>
+      <w:proofErr w:type="spellEnd"/>
+      <w:r>
+        <w:rPr>
+          <w:sz w:val="18"/>
+          <w:szCs w:val="18"/>
+        </w:rPr>
+        <w:t xml:space="preserve">, </w:t>
+      </w:r>
+      <w:proofErr w:type="spellStart"/>
+      <w:r>
+        <w:rPr>
+          <w:sz w:val="18"/>
+          <w:szCs w:val="18"/>
+        </w:rPr>
+        <w:t>LlamaIndex</w:t>
+      </w:r>
+      <w:proofErr w:type="spellEnd"/>
+      <w:r>
+        <w:rPr>
+          <w:sz w:val="18"/>
+          <w:szCs w:val="18"/>
+        </w:rPr>
+        <w:t xml:space="preserve">, </w:t>
       </w:r>
       <w:r>
         <w:rPr>
@@ -366,13 +446,47 @@
         </w:rPr>
         <w:t xml:space="preserve">Graph, </w:t>
       </w:r>
-      <w:r>
-        <w:rPr>
-          <w:sz w:val="18"/>
-          <w:szCs w:val="18"/>
-        </w:rPr>
-        <w:t>CrewAI, AutoGen, ReAct</w:t>
-      </w:r>
+      <w:proofErr w:type="spellStart"/>
+      <w:r>
+        <w:rPr>
+          <w:sz w:val="18"/>
+          <w:szCs w:val="18"/>
+        </w:rPr>
+        <w:t>CrewAI</w:t>
+      </w:r>
+      <w:proofErr w:type="spellEnd"/>
+      <w:r>
+        <w:rPr>
+          <w:sz w:val="18"/>
+          <w:szCs w:val="18"/>
+        </w:rPr>
+        <w:t xml:space="preserve">, </w:t>
+      </w:r>
+      <w:proofErr w:type="spellStart"/>
+      <w:r>
+        <w:rPr>
+          <w:sz w:val="18"/>
+          <w:szCs w:val="18"/>
+        </w:rPr>
+        <w:t>AutoGen</w:t>
+      </w:r>
+      <w:proofErr w:type="spellEnd"/>
+      <w:r>
+        <w:rPr>
+          <w:sz w:val="18"/>
+          <w:szCs w:val="18"/>
+        </w:rPr>
+        <w:t xml:space="preserve">, </w:t>
+      </w:r>
+      <w:proofErr w:type="spellStart"/>
+      <w:r>
+        <w:rPr>
+          <w:sz w:val="18"/>
+          <w:szCs w:val="18"/>
+        </w:rPr>
+        <w:t>ReAct</w:t>
+      </w:r>
+      <w:proofErr w:type="spellEnd"/>
       <w:r>
         <w:rPr>
           <w:sz w:val="18"/>
@@ -385,14 +499,7 @@
           <w:sz w:val="18"/>
           <w:szCs w:val="18"/>
         </w:rPr>
-        <w:t>.</w:t>
-      </w:r>
-      <w:r>
-        <w:rPr>
-          <w:sz w:val="18"/>
-          <w:szCs w:val="18"/>
-        </w:rPr>
-        <w:t xml:space="preserve"> </w:t>
+        <w:t xml:space="preserve">. </w:t>
       </w:r>
     </w:p>
     <w:p>
@@ -403,6 +510,10 @@
           <w:numId w:val="3"/>
         </w:numPr>
         <w:spacing w:line="240" w:lineRule="auto"/>
+        <w:rPr>
+          <w:sz w:val="18"/>
+          <w:szCs w:val="18"/>
+        </w:rPr>
       </w:pPr>
       <w:r>
         <w:rPr>
@@ -464,6 +575,7 @@
         </w:rPr>
         <w:t xml:space="preserve"> </w:t>
       </w:r>
+      <w:proofErr w:type="spellStart"/>
       <w:r>
         <w:rPr>
           <w:sz w:val="18"/>
@@ -471,6 +583,7 @@
         </w:rPr>
         <w:t>FastAPI</w:t>
       </w:r>
+      <w:proofErr w:type="spellEnd"/>
       <w:r>
         <w:rPr>
           <w:sz w:val="18"/>
@@ -497,14 +610,7 @@
           <w:sz w:val="18"/>
           <w:szCs w:val="18"/>
         </w:rPr>
-        <w:t xml:space="preserve">, </w:t>
-      </w:r>
-      <w:r>
-        <w:rPr>
-          <w:sz w:val="18"/>
-          <w:szCs w:val="18"/>
-        </w:rPr>
-        <w:t>JWT Authentication</w:t>
+        <w:t>, JWT Authentication</w:t>
       </w:r>
       <w:r>
         <w:rPr>
@@ -522,6 +628,10 @@
           <w:numId w:val="3"/>
         </w:numPr>
         <w:spacing w:line="240" w:lineRule="auto"/>
+        <w:rPr>
+          <w:sz w:val="18"/>
+          <w:szCs w:val="18"/>
+        </w:rPr>
       </w:pPr>
       <w:r>
         <w:rPr>
@@ -569,7 +679,23 @@
           <w:sz w:val="18"/>
           <w:szCs w:val="18"/>
         </w:rPr>
-        <w:t>(Pinecone, ChromaDB, FAISS)</w:t>
+        <w:t xml:space="preserve">(Pinecone, </w:t>
+      </w:r>
+      <w:proofErr w:type="spellStart"/>
+      <w:r>
+        <w:rPr>
+          <w:sz w:val="18"/>
+          <w:szCs w:val="18"/>
+        </w:rPr>
+        <w:t>ChromaDB</w:t>
+      </w:r>
+      <w:proofErr w:type="spellEnd"/>
+      <w:r>
+        <w:rPr>
+          <w:sz w:val="18"/>
+          <w:szCs w:val="18"/>
+        </w:rPr>
+        <w:t>, FAISS)</w:t>
       </w:r>
       <w:r>
         <w:rPr>
@@ -601,12 +727,21 @@
         </w:rPr>
         <w:t xml:space="preserve"> </w:t>
       </w:r>
-      <w:r>
-        <w:rPr>
-          <w:sz w:val="18"/>
-          <w:szCs w:val="18"/>
-        </w:rPr>
-        <w:t>Metabase,</w:t>
+      <w:proofErr w:type="spellStart"/>
+      <w:r>
+        <w:rPr>
+          <w:sz w:val="18"/>
+          <w:szCs w:val="18"/>
+        </w:rPr>
+        <w:t>Metabase</w:t>
+      </w:r>
+      <w:proofErr w:type="spellEnd"/>
+      <w:r>
+        <w:rPr>
+          <w:sz w:val="18"/>
+          <w:szCs w:val="18"/>
+        </w:rPr>
+        <w:t>,</w:t>
       </w:r>
       <w:r>
         <w:rPr>
@@ -645,6 +780,10 @@
           <w:numId w:val="3"/>
         </w:numPr>
         <w:spacing w:line="240" w:lineRule="auto"/>
+        <w:rPr>
+          <w:sz w:val="18"/>
+          <w:szCs w:val="18"/>
+        </w:rPr>
       </w:pPr>
       <w:r>
         <w:rPr>
@@ -670,13 +809,11 @@
         <w:t xml:space="preserve"> Python,</w:t>
       </w:r>
       <w:r>
-        <w:t xml:space="preserve"> </w:t>
-      </w:r>
-      <w:r>
-        <w:t>Pandas</w:t>
-      </w:r>
-      <w:r>
-        <w:t>,</w:t>
+        <w:rPr>
+          <w:sz w:val="18"/>
+          <w:szCs w:val="18"/>
+        </w:rPr>
+        <w:t xml:space="preserve"> Pandas,</w:t>
       </w:r>
       <w:r>
         <w:rPr>
@@ -715,20 +852,42 @@
           <w:numId w:val="3"/>
         </w:numPr>
         <w:spacing w:line="240" w:lineRule="auto"/>
-      </w:pPr>
-      <w:r>
-        <w:rPr>
-          <w:b/>
-          <w:bCs/>
-          <w:sz w:val="18"/>
-          <w:szCs w:val="18"/>
-        </w:rPr>
-        <w:t>Deployment &amp; ML</w:t>
-      </w:r>
-      <w:r>
-        <w:rPr>
-          <w:b/>
-          <w:bCs/>
+        <w:rPr>
+          <w:sz w:val="18"/>
+          <w:szCs w:val="18"/>
+        </w:rPr>
+      </w:pPr>
+      <w:r>
+        <w:rPr>
+          <w:b/>
+          <w:bCs/>
+          <w:sz w:val="18"/>
+          <w:szCs w:val="18"/>
+        </w:rPr>
+        <w:t xml:space="preserve">Deployment &amp; </w:t>
+      </w:r>
+      <w:proofErr w:type="spellStart"/>
+      <w:r>
+        <w:rPr>
+          <w:b/>
+          <w:bCs/>
+          <w:sz w:val="18"/>
+          <w:szCs w:val="18"/>
+        </w:rPr>
+        <w:t>LLMOps</w:t>
+      </w:r>
+      <w:proofErr w:type="spellEnd"/>
+      <w:r>
+        <w:rPr>
+          <w:b/>
+          <w:bCs/>
+          <w:sz w:val="18"/>
+          <w:szCs w:val="18"/>
+        </w:rPr>
+        <w:t>:</w:t>
+      </w:r>
+      <w:r>
+        <w:rPr>
           <w:sz w:val="18"/>
           <w:szCs w:val="18"/>
         </w:rPr>
@@ -736,12 +895,24 @@
       </w:r>
       <w:r>
         <w:rPr>
-          <w:b/>
-          <w:bCs/>
-          <w:sz w:val="18"/>
-          <w:szCs w:val="18"/>
-        </w:rPr>
-        <w:t>Ops:</w:t>
+          <w:sz w:val="18"/>
+          <w:szCs w:val="18"/>
+        </w:rPr>
+        <w:t>Docker, AWS,</w:t>
+      </w:r>
+      <w:r>
+        <w:rPr>
+          <w:sz w:val="18"/>
+          <w:szCs w:val="18"/>
+        </w:rPr>
+        <w:t xml:space="preserve"> GCP,</w:t>
+      </w:r>
+      <w:r>
+        <w:rPr>
+          <w:sz w:val="18"/>
+          <w:szCs w:val="18"/>
+        </w:rPr>
+        <w:t xml:space="preserve"> Jenkins, CI/CD,</w:t>
       </w:r>
       <w:r>
         <w:rPr>
@@ -750,13 +921,54 @@
         </w:rPr>
         <w:t xml:space="preserve"> </w:t>
       </w:r>
-      <w:r>
-        <w:rPr>
-          <w:sz w:val="18"/>
-          <w:szCs w:val="18"/>
-        </w:rPr>
-        <w:t>Docker, AWS, Jenkins, CI/CD, LangSmith/LangFuse</w:t>
-      </w:r>
+      <w:proofErr w:type="spellStart"/>
+      <w:r>
+        <w:rPr>
+          <w:sz w:val="18"/>
+          <w:szCs w:val="18"/>
+        </w:rPr>
+        <w:t>Vercel</w:t>
+      </w:r>
+      <w:proofErr w:type="spellEnd"/>
+      <w:r>
+        <w:rPr>
+          <w:sz w:val="18"/>
+          <w:szCs w:val="18"/>
+        </w:rPr>
+        <w:t>,</w:t>
+      </w:r>
+      <w:r>
+        <w:rPr>
+          <w:sz w:val="18"/>
+          <w:szCs w:val="18"/>
+        </w:rPr>
+        <w:t xml:space="preserve"> </w:t>
+      </w:r>
+      <w:proofErr w:type="spellStart"/>
+      <w:r>
+        <w:rPr>
+          <w:sz w:val="18"/>
+          <w:szCs w:val="18"/>
+        </w:rPr>
+        <w:t>LangSmith</w:t>
+      </w:r>
+      <w:proofErr w:type="spellEnd"/>
+      <w:r>
+        <w:rPr>
+          <w:sz w:val="18"/>
+          <w:szCs w:val="18"/>
+        </w:rPr>
+        <w:t>/</w:t>
+      </w:r>
+      <w:proofErr w:type="spellStart"/>
+      <w:r>
+        <w:rPr>
+          <w:sz w:val="18"/>
+          <w:szCs w:val="18"/>
+        </w:rPr>
+        <w:t>LangFuse</w:t>
+      </w:r>
+      <w:proofErr w:type="spellEnd"/>
       <w:r>
         <w:rPr>
           <w:sz w:val="18"/>
@@ -773,6 +985,10 @@
           <w:numId w:val="3"/>
         </w:numPr>
         <w:spacing w:line="240" w:lineRule="auto"/>
+        <w:rPr>
+          <w:sz w:val="18"/>
+          <w:szCs w:val="18"/>
+        </w:rPr>
       </w:pPr>
       <w:r>
         <w:rPr>
@@ -804,15 +1020,9 @@
           <w:sz w:val="18"/>
           <w:szCs w:val="18"/>
         </w:rPr>
-        <w:t>, Postman</w:t>
-      </w:r>
-      <w:r>
-        <w:rPr>
-          <w:sz w:val="18"/>
-          <w:szCs w:val="18"/>
-        </w:rPr>
-        <w:t xml:space="preserve">, </w:t>
-      </w:r>
+        <w:t xml:space="preserve">, Postman, </w:t>
+      </w:r>
+      <w:proofErr w:type="spellStart"/>
       <w:r>
         <w:rPr>
           <w:sz w:val="18"/>
@@ -820,26 +1030,13 @@
         </w:rPr>
         <w:t>Jupyter</w:t>
       </w:r>
-      <w:r>
-        <w:rPr>
-          <w:sz w:val="18"/>
-          <w:szCs w:val="18"/>
-        </w:rPr>
-        <w:t>, Ver</w:t>
-      </w:r>
-      <w:r>
-        <w:rPr>
-          <w:sz w:val="18"/>
-          <w:szCs w:val="18"/>
-        </w:rPr>
-        <w:t>c</w:t>
-      </w:r>
-      <w:r>
-        <w:rPr>
-          <w:sz w:val="18"/>
-          <w:szCs w:val="18"/>
-        </w:rPr>
-        <w:t>el</w:t>
+      <w:proofErr w:type="spellEnd"/>
+      <w:r>
+        <w:rPr>
+          <w:sz w:val="18"/>
+          <w:szCs w:val="18"/>
+        </w:rPr>
+        <w:t>, Anaconda, Browser Automation (Playwright), Claude</w:t>
       </w:r>
       <w:r>
         <w:rPr>
@@ -914,7 +1111,30 @@
         </w:tabs>
       </w:pPr>
       <w:r>
-        <w:t xml:space="preserve">Software Engineer, Kent RO Systems Pvt Ltd </w:t>
+        <w:t>Software Engineer, K</w:t>
+      </w:r>
+      <w:r>
+        <w:t>ENT</w:t>
+      </w:r>
+      <w:r>
+        <w:t xml:space="preserve"> RO Systems Pvt Ltd </w:t>
+      </w:r>
+      <w:r>
+        <w:t>(K</w:t>
+      </w:r>
+      <w:r>
+        <w:t>ENT</w:t>
+      </w:r>
+      <w:r>
+        <w:t xml:space="preserve"> </w:t>
+      </w:r>
+      <w:proofErr w:type="spellStart"/>
+      <w:r>
+        <w:t>CamEye</w:t>
+      </w:r>
+      <w:proofErr w:type="spellEnd"/>
+      <w:r>
+        <w:t>)</w:t>
       </w:r>
       <w:r>
         <w:tab/>
@@ -929,12 +1149,14 @@
           <w:numId w:val="3"/>
         </w:numPr>
         <w:rPr>
-          <w:sz w:val="18"/>
-          <w:szCs w:val="18"/>
-        </w:rPr>
-      </w:pPr>
-      <w:r>
-        <w:rPr>
+          <w:rFonts w:ascii="Open Sans" w:hAnsi="Open Sans" w:cs="Open Sans"/>
+          <w:sz w:val="18"/>
+          <w:szCs w:val="18"/>
+        </w:rPr>
+      </w:pPr>
+      <w:r>
+        <w:rPr>
+          <w:rFonts w:ascii="Open Sans" w:hAnsi="Open Sans" w:cs="Open Sans"/>
           <w:color w:val="1E2431"/>
           <w:sz w:val="18"/>
           <w:szCs w:val="18"/>
@@ -943,6 +1165,7 @@
       </w:r>
       <w:r>
         <w:rPr>
+          <w:rFonts w:ascii="Open Sans" w:hAnsi="Open Sans" w:cs="Open Sans"/>
           <w:b/>
           <w:bCs/>
           <w:color w:val="1E2431"/>
@@ -953,6 +1176,7 @@
       </w:r>
       <w:r>
         <w:rPr>
+          <w:rFonts w:ascii="Open Sans" w:hAnsi="Open Sans" w:cs="Open Sans"/>
           <w:color w:val="1E2431"/>
           <w:sz w:val="18"/>
           <w:szCs w:val="18"/>
@@ -961,6 +1185,7 @@
       </w:r>
       <w:r>
         <w:rPr>
+          <w:rFonts w:ascii="Open Sans" w:hAnsi="Open Sans" w:cs="Open Sans"/>
           <w:b/>
           <w:bCs/>
           <w:color w:val="1E2431"/>
@@ -971,24 +1196,47 @@
       </w:r>
       <w:r>
         <w:rPr>
+          <w:rFonts w:ascii="Open Sans" w:hAnsi="Open Sans" w:cs="Open Sans"/>
           <w:color w:val="1E2431"/>
           <w:sz w:val="18"/>
           <w:szCs w:val="18"/>
         </w:rPr>
-        <w:t xml:space="preserve"> Textract and </w:t>
-      </w:r>
-      <w:r>
-        <w:rPr>
-          <w:b/>
-          <w:bCs/>
+        <w:t xml:space="preserve"> </w:t>
+      </w:r>
+      <w:proofErr w:type="spellStart"/>
+      <w:r>
+        <w:rPr>
+          <w:rFonts w:ascii="Open Sans" w:hAnsi="Open Sans" w:cs="Open Sans"/>
           <w:color w:val="1E2431"/>
           <w:sz w:val="18"/>
           <w:szCs w:val="18"/>
         </w:rPr>
+        <w:t>Textract</w:t>
+      </w:r>
+      <w:proofErr w:type="spellEnd"/>
+      <w:r>
+        <w:rPr>
+          <w:rFonts w:ascii="Open Sans" w:hAnsi="Open Sans" w:cs="Open Sans"/>
+          <w:color w:val="1E2431"/>
+          <w:sz w:val="18"/>
+          <w:szCs w:val="18"/>
+        </w:rPr>
+        <w:t xml:space="preserve"> and </w:t>
+      </w:r>
+      <w:r>
+        <w:rPr>
+          <w:rFonts w:ascii="Open Sans" w:hAnsi="Open Sans" w:cs="Open Sans"/>
+          <w:b/>
+          <w:bCs/>
+          <w:color w:val="1E2431"/>
+          <w:sz w:val="18"/>
+          <w:szCs w:val="18"/>
+        </w:rPr>
         <w:t>Mistral</w:t>
       </w:r>
       <w:r>
         <w:rPr>
+          <w:rFonts w:ascii="Open Sans" w:hAnsi="Open Sans" w:cs="Open Sans"/>
           <w:color w:val="1E2431"/>
           <w:sz w:val="18"/>
           <w:szCs w:val="18"/>
@@ -997,6 +1245,7 @@
       </w:r>
       <w:r>
         <w:rPr>
+          <w:rFonts w:ascii="Open Sans" w:hAnsi="Open Sans" w:cs="Open Sans"/>
           <w:color w:val="1E2431"/>
           <w:sz w:val="18"/>
           <w:szCs w:val="18"/>
@@ -1005,6 +1254,7 @@
       </w:r>
       <w:r>
         <w:rPr>
+          <w:rFonts w:ascii="Open Sans" w:hAnsi="Open Sans" w:cs="Open Sans"/>
           <w:color w:val="1E2431"/>
           <w:sz w:val="18"/>
           <w:szCs w:val="18"/>
@@ -1013,6 +1263,7 @@
       </w:r>
       <w:r>
         <w:rPr>
+          <w:rFonts w:ascii="Open Sans" w:hAnsi="Open Sans" w:cs="Open Sans"/>
           <w:b/>
           <w:bCs/>
           <w:color w:val="1E2431"/>
@@ -1023,6 +1274,7 @@
       </w:r>
       <w:r>
         <w:rPr>
+          <w:rFonts w:ascii="Open Sans" w:hAnsi="Open Sans" w:cs="Open Sans"/>
           <w:b/>
           <w:bCs/>
           <w:color w:val="1E2431"/>
@@ -1033,6 +1285,7 @@
       </w:r>
       <w:r>
         <w:rPr>
+          <w:rFonts w:ascii="Open Sans" w:hAnsi="Open Sans" w:cs="Open Sans"/>
           <w:color w:val="1E2431"/>
           <w:sz w:val="18"/>
           <w:szCs w:val="18"/>
@@ -1041,6 +1294,7 @@
       </w:r>
       <w:r>
         <w:rPr>
+          <w:rFonts w:ascii="Open Sans" w:hAnsi="Open Sans" w:cs="Open Sans"/>
           <w:color w:val="1E2431"/>
           <w:sz w:val="18"/>
           <w:szCs w:val="18"/>
@@ -1078,14 +1332,7 @@
           <w:sz w:val="18"/>
           <w:szCs w:val="18"/>
         </w:rPr>
-        <w:t xml:space="preserve"> and ensuring high availability</w:t>
-      </w:r>
-      <w:r>
-        <w:rPr>
-          <w:sz w:val="18"/>
-          <w:szCs w:val="18"/>
-        </w:rPr>
-        <w:t xml:space="preserve">. </w:t>
+        <w:t xml:space="preserve"> and ensuring high availability. </w:t>
       </w:r>
     </w:p>
     <w:p>
@@ -1127,14 +1374,7 @@
           <w:sz w:val="18"/>
           <w:szCs w:val="18"/>
         </w:rPr>
-        <w:t>with role-b</w:t>
-      </w:r>
-      <w:r>
-        <w:rPr>
-          <w:sz w:val="18"/>
-          <w:szCs w:val="18"/>
-        </w:rPr>
-        <w:t xml:space="preserve">ased and criteria-based filters, enhancing decision-making and data accessibility across departments. </w:t>
+        <w:t xml:space="preserve">with role-based and criteria-based filters, enhancing decision-making and data accessibility across departments. </w:t>
       </w:r>
     </w:p>
     <w:p>
@@ -1202,16 +1442,7 @@
           <w:sz w:val="18"/>
           <w:szCs w:val="18"/>
         </w:rPr>
-        <w:t>SSRS</w:t>
-      </w:r>
-      <w:r>
-        <w:rPr>
-          <w:b/>
-          <w:bCs/>
-          <w:sz w:val="18"/>
-          <w:szCs w:val="18"/>
-        </w:rPr>
-        <w:t xml:space="preserve"> </w:t>
+        <w:t xml:space="preserve">SSRS </w:t>
       </w:r>
       <w:r>
         <w:rPr>
@@ -1222,6 +1453,7 @@
         </w:rPr>
         <w:t xml:space="preserve">and </w:t>
       </w:r>
+      <w:proofErr w:type="spellStart"/>
       <w:r>
         <w:rPr>
           <w:b/>
@@ -1231,19 +1463,13 @@
         </w:rPr>
         <w:t>Metabase</w:t>
       </w:r>
-      <w:r>
-        <w:rPr>
-          <w:sz w:val="18"/>
-          <w:szCs w:val="18"/>
-        </w:rPr>
-        <w:t>, providing real-time data visibility and accelerating cross-departmental decision-making</w:t>
-      </w:r>
-      <w:r>
-        <w:rPr>
-          <w:sz w:val="18"/>
-          <w:szCs w:val="18"/>
-        </w:rPr>
-        <w:t xml:space="preserve">. </w:t>
+      <w:proofErr w:type="spellEnd"/>
+      <w:r>
+        <w:rPr>
+          <w:sz w:val="18"/>
+          <w:szCs w:val="18"/>
+        </w:rPr>
+        <w:t xml:space="preserve">, providing real-time data visibility and accelerating cross-departmental decision-making. </w:t>
       </w:r>
     </w:p>
     <w:p>
@@ -1259,7 +1485,15 @@
         </w:tabs>
       </w:pPr>
       <w:r>
-        <w:t xml:space="preserve">Associate Software Developer, TechnoIdentity </w:t>
+        <w:t xml:space="preserve">Associate Software Developer, </w:t>
+      </w:r>
+      <w:proofErr w:type="spellStart"/>
+      <w:r>
+        <w:t>TechnoIdentity</w:t>
+      </w:r>
+      <w:proofErr w:type="spellEnd"/>
+      <w:r>
+        <w:t xml:space="preserve"> </w:t>
       </w:r>
       <w:r>
         <w:tab/>
@@ -1510,8 +1744,19 @@
           <w:sz w:val="18"/>
           <w:szCs w:val="18"/>
         </w:rPr>
-        <w:t>AWS Textract</w:t>
-      </w:r>
+        <w:t xml:space="preserve">AWS </w:t>
+      </w:r>
+      <w:proofErr w:type="spellStart"/>
+      <w:r>
+        <w:rPr>
+          <w:b/>
+          <w:bCs/>
+          <w:sz w:val="18"/>
+          <w:szCs w:val="18"/>
+        </w:rPr>
+        <w:t>Textract</w:t>
+      </w:r>
+      <w:proofErr w:type="spellEnd"/>
       <w:r>
         <w:rPr>
           <w:sz w:val="18"/>
@@ -1871,7 +2116,23 @@
           <w:sz w:val="18"/>
           <w:szCs w:val="18"/>
         </w:rPr>
-        <w:t>Managed REST APIs (Spring Boot) and frontend modules (Angular) to orchestrate real-time HR data tracking and synchronization</w:t>
+        <w:t xml:space="preserve">Managed </w:t>
+      </w:r>
+      <w:r>
+        <w:rPr>
+          <w:b/>
+          <w:bCs/>
+          <w:sz w:val="18"/>
+          <w:szCs w:val="18"/>
+        </w:rPr>
+        <w:t>REST APIs</w:t>
+      </w:r>
+      <w:r>
+        <w:rPr>
+          <w:sz w:val="18"/>
+          <w:szCs w:val="18"/>
+        </w:rPr>
+        <w:t xml:space="preserve"> (Spring Boot) and frontend modules (Angular) to orchestrate real-time HR data tracking and synchronization</w:t>
       </w:r>
       <w:r>
         <w:rPr>
@@ -1895,12 +2156,51 @@
           <w:sz w:val="18"/>
           <w:szCs w:val="18"/>
         </w:rPr>
-        <w:t xml:space="preserve">Integrated automated data pipelines to sync and validate check-ins, leave logs, and key HR metrics. </w:t>
-      </w:r>
-    </w:p>
-    <w:p>
-      <w:pPr>
-        <w:spacing w:after="6"/>
+        <w:t>Integrated automated data pipelines to sync and validate check-ins, leave logs, and key HR metrics.</w:t>
+      </w:r>
+    </w:p>
+    <w:p>
+      <w:pPr>
+        <w:pStyle w:val="ListParagraph"/>
+        <w:numPr>
+          <w:ilvl w:val="0"/>
+          <w:numId w:val="6"/>
+        </w:numPr>
+        <w:spacing w:line="240" w:lineRule="auto"/>
+        <w:rPr>
+          <w:sz w:val="18"/>
+          <w:szCs w:val="18"/>
+        </w:rPr>
+      </w:pPr>
+      <w:r>
+        <w:rPr>
+          <w:b/>
+          <w:bCs/>
+          <w:sz w:val="18"/>
+          <w:szCs w:val="18"/>
+        </w:rPr>
+        <w:t>Automated</w:t>
+      </w:r>
+      <w:r>
+        <w:rPr>
+          <w:sz w:val="18"/>
+          <w:szCs w:val="18"/>
+        </w:rPr>
+        <w:t xml:space="preserve"> </w:t>
+      </w:r>
+      <w:r>
+        <w:rPr>
+          <w:sz w:val="18"/>
+          <w:szCs w:val="18"/>
+        </w:rPr>
+        <w:t>onboarding and HR data migration workflows, significantly reducing manual intervention.</w:t>
+      </w:r>
+    </w:p>
+    <w:p>
+      <w:pPr>
+        <w:pStyle w:val="ListParagraph"/>
+        <w:spacing w:line="240" w:lineRule="auto"/>
+        <w:ind w:left="431"/>
       </w:pPr>
     </w:p>
     <w:p>
@@ -2125,7 +2425,31 @@
           <w:sz w:val="18"/>
           <w:szCs w:val="18"/>
         </w:rPr>
-        <w:t xml:space="preserve">. </w:t>
+        <w:t>.</w:t>
+      </w:r>
+    </w:p>
+    <w:p>
+      <w:pPr>
+        <w:pStyle w:val="ListParagraph"/>
+        <w:numPr>
+          <w:ilvl w:val="0"/>
+          <w:numId w:val="8"/>
+        </w:numPr>
+        <w:spacing w:line="240" w:lineRule="auto"/>
+      </w:pPr>
+      <w:r>
+        <w:rPr>
+          <w:sz w:val="18"/>
+          <w:szCs w:val="18"/>
+        </w:rPr>
+        <w:t>Built reusable automation solutions inspired by enterprise RPA practices (similar to UiPath workflows) using browser automation and custom scripting, reducing manual effort and increasing processing accuracy.</w:t>
+      </w:r>
+      <w:r>
+        <w:rPr>
+          <w:sz w:val="18"/>
+          <w:szCs w:val="18"/>
+        </w:rPr>
+        <w:t xml:space="preserve"> </w:t>
       </w:r>
       <w:r>
         <w:rPr>
@@ -2425,13 +2749,15 @@
         </w:rPr>
         <w:t xml:space="preserve"> using </w:t>
       </w:r>
-      <w:r>
-        <w:rPr>
-          <w:sz w:val="18"/>
-          <w:szCs w:val="18"/>
-        </w:rPr>
-        <w:t>LangChain, CrewAI, AutoGen</w:t>
-      </w:r>
+      <w:proofErr w:type="spellStart"/>
+      <w:r>
+        <w:rPr>
+          <w:sz w:val="18"/>
+          <w:szCs w:val="18"/>
+        </w:rPr>
+        <w:t>LangChain</w:t>
+      </w:r>
+      <w:proofErr w:type="spellEnd"/>
       <w:r>
         <w:rPr>
           <w:sz w:val="18"/>
@@ -2439,6 +2765,39 @@
         </w:rPr>
         <w:t xml:space="preserve">, </w:t>
       </w:r>
+      <w:proofErr w:type="spellStart"/>
+      <w:r>
+        <w:rPr>
+          <w:sz w:val="18"/>
+          <w:szCs w:val="18"/>
+        </w:rPr>
+        <w:t>CrewAI</w:t>
+      </w:r>
+      <w:proofErr w:type="spellEnd"/>
+      <w:r>
+        <w:rPr>
+          <w:sz w:val="18"/>
+          <w:szCs w:val="18"/>
+        </w:rPr>
+        <w:t xml:space="preserve">, </w:t>
+      </w:r>
+      <w:proofErr w:type="spellStart"/>
+      <w:r>
+        <w:rPr>
+          <w:sz w:val="18"/>
+          <w:szCs w:val="18"/>
+        </w:rPr>
+        <w:t>AutoGen</w:t>
+      </w:r>
+      <w:proofErr w:type="spellEnd"/>
+      <w:r>
+        <w:rPr>
+          <w:sz w:val="18"/>
+          <w:szCs w:val="18"/>
+        </w:rPr>
+        <w:t xml:space="preserve">, </w:t>
+      </w:r>
+      <w:proofErr w:type="spellStart"/>
       <w:r>
         <w:rPr>
           <w:sz w:val="18"/>
@@ -2446,6 +2805,7 @@
         </w:rPr>
         <w:t>LlamaIndex</w:t>
       </w:r>
+      <w:proofErr w:type="spellEnd"/>
       <w:r>
         <w:rPr>
           <w:sz w:val="18"/>
@@ -2502,7 +2862,15 @@
           <w:sz w:val="18"/>
           <w:szCs w:val="18"/>
         </w:rPr>
-        <w:t>Applied Deep Learning foundations and Transformer architectures to build and deploy scalable GenAI models via FastAP</w:t>
+        <w:t xml:space="preserve">Applied Deep Learning foundations and Transformer architectures to build and deploy scalable GenAI models via </w:t>
+      </w:r>
+      <w:proofErr w:type="spellStart"/>
+      <w:r>
+        <w:rPr>
+          <w:sz w:val="18"/>
+          <w:szCs w:val="18"/>
+        </w:rPr>
+        <w:t>FastAP</w:t>
       </w:r>
       <w:r>
         <w:rPr>
@@ -2511,6 +2879,7 @@
         </w:rPr>
         <w:t>I</w:t>
       </w:r>
+      <w:proofErr w:type="spellEnd"/>
       <w:r>
         <w:rPr>
           <w:sz w:val="18"/>
@@ -2541,21 +2910,41 @@
           <w:numId w:val="9"/>
         </w:numPr>
         <w:spacing w:line="240" w:lineRule="auto"/>
-      </w:pPr>
-      <w:r>
+        <w:rPr>
+          <w:sz w:val="18"/>
+          <w:szCs w:val="18"/>
+        </w:rPr>
+      </w:pPr>
+      <w:r>
+        <w:rPr>
+          <w:sz w:val="18"/>
+          <w:szCs w:val="18"/>
+        </w:rPr>
         <w:t xml:space="preserve">Deployed </w:t>
       </w:r>
-      <w:r>
-        <w:rPr>
-          <w:b/>
-          <w:bCs/>
+      <w:proofErr w:type="spellStart"/>
+      <w:r>
+        <w:rPr>
+          <w:b/>
+          <w:bCs/>
+          <w:sz w:val="18"/>
+          <w:szCs w:val="18"/>
         </w:rPr>
         <w:t>FastMCP</w:t>
       </w:r>
-      <w:r>
+      <w:proofErr w:type="spellEnd"/>
+      <w:r>
+        <w:rPr>
+          <w:sz w:val="18"/>
+          <w:szCs w:val="18"/>
+        </w:rPr>
         <w:t xml:space="preserve"> servers to enable secure, standardized tool-calling for autonomous AI agents</w:t>
       </w:r>
       <w:r>
+        <w:rPr>
+          <w:sz w:val="18"/>
+          <w:szCs w:val="18"/>
+        </w:rPr>
         <w:t>.</w:t>
       </w:r>
     </w:p>
@@ -2567,22 +2956,33 @@
           <w:numId w:val="9"/>
         </w:numPr>
         <w:spacing w:line="240" w:lineRule="auto"/>
-      </w:pPr>
-      <w:r>
+        <w:rPr>
+          <w:sz w:val="18"/>
+          <w:szCs w:val="18"/>
+        </w:rPr>
+      </w:pPr>
+      <w:r>
+        <w:rPr>
+          <w:sz w:val="18"/>
+          <w:szCs w:val="18"/>
+        </w:rPr>
         <w:t xml:space="preserve">Utilized </w:t>
       </w:r>
       <w:r>
         <w:rPr>
           <w:b/>
           <w:bCs/>
+          <w:sz w:val="18"/>
+          <w:szCs w:val="18"/>
         </w:rPr>
         <w:t>Pandas</w:t>
       </w:r>
       <w:r>
-        <w:t xml:space="preserve"> for complex data preprocessing within Agentic RAG workflows</w:t>
-      </w:r>
-      <w:r>
-        <w:t>.</w:t>
+        <w:rPr>
+          <w:sz w:val="18"/>
+          <w:szCs w:val="18"/>
+        </w:rPr>
+        <w:t xml:space="preserve"> for complex data preprocessing within Agentic RAG workflows.</w:t>
       </w:r>
     </w:p>
     <w:p>
@@ -2626,7 +3026,21 @@
           <w:sz w:val="18"/>
           <w:szCs w:val="18"/>
         </w:rPr>
-        <w:t xml:space="preserve">Trained in modern full-stack web technologies with a strong focus on building AI-powered web applications. </w:t>
+        <w:t>T</w:t>
+      </w:r>
+      <w:r>
+        <w:rPr>
+          <w:sz w:val="18"/>
+          <w:szCs w:val="18"/>
+        </w:rPr>
+        <w:t>rained in full-stack development using React.js, Next.js, Node.js, Express.js, MongoDB, and Git.</w:t>
+      </w:r>
+      <w:r>
+        <w:rPr>
+          <w:sz w:val="18"/>
+          <w:szCs w:val="18"/>
+        </w:rPr>
+        <w:t xml:space="preserve"> </w:t>
       </w:r>
     </w:p>
     <w:p>
@@ -2643,7 +3057,14 @@
           <w:sz w:val="18"/>
           <w:szCs w:val="18"/>
         </w:rPr>
-        <w:t xml:space="preserve">Gained hands-on experience with HTML, CSS, JavaScript, React, Next.js, Node.js, Express.js, MongoDB, and Git. </w:t>
+        <w:t>Built AI-powered web applications while collaborating on real-world development projects</w:t>
+      </w:r>
+      <w:r>
+        <w:rPr>
+          <w:sz w:val="18"/>
+          <w:szCs w:val="18"/>
+        </w:rPr>
+        <w:t xml:space="preserve">. </w:t>
       </w:r>
     </w:p>
     <w:p>
@@ -2654,36 +3075,25 @@
           <w:numId w:val="9"/>
         </w:numPr>
         <w:spacing w:line="240" w:lineRule="auto"/>
-      </w:pPr>
-      <w:r>
-        <w:rPr>
-          <w:sz w:val="18"/>
-          <w:szCs w:val="18"/>
-        </w:rPr>
-        <w:t xml:space="preserve">Actively participated in DSA coding contests, improving problem-solving and algorithmic thinking. </w:t>
-      </w:r>
-    </w:p>
-    <w:p>
-      <w:pPr>
-        <w:pStyle w:val="ListParagraph"/>
-        <w:numPr>
-          <w:ilvl w:val="0"/>
-          <w:numId w:val="9"/>
-        </w:numPr>
-        <w:spacing w:line="240" w:lineRule="auto"/>
-      </w:pPr>
-      <w:r>
-        <w:rPr>
-          <w:sz w:val="18"/>
-          <w:szCs w:val="18"/>
-        </w:rPr>
-        <w:t xml:space="preserve">Collaborated on group projects and real-world development challenges, strengthening teamwork and practical development skills. </w:t>
-      </w:r>
-    </w:p>
-    <w:p>
-      <w:pPr>
-        <w:spacing w:line="240" w:lineRule="auto"/>
-      </w:pPr>
+        <w:rPr>
+          <w:sz w:val="18"/>
+          <w:szCs w:val="18"/>
+        </w:rPr>
+      </w:pPr>
+      <w:r>
+        <w:rPr>
+          <w:sz w:val="18"/>
+          <w:szCs w:val="18"/>
+        </w:rPr>
+        <w:t>Strengthened DSA, problem-solving, teamwork, and practical development skills through coding contests and real-world projects</w:t>
+      </w:r>
+      <w:r>
+        <w:rPr>
+          <w:sz w:val="18"/>
+          <w:szCs w:val="18"/>
+        </w:rPr>
+        <w:t>.</w:t>
+      </w:r>
     </w:p>
     <w:sectPr>
       <w:pgSz w:w="11952" w:h="16848"/>
@@ -2696,7 +3106,7 @@
 </file>
 
 <file path=word/endnotes.xml><?xml version="1.0" encoding="utf-8"?>
-<w:endnotes xmlns:wpc="http://schemas.microsoft.com/office/word/2010/wordprocessingCanvas" xmlns:cx="http://schemas.microsoft.com/office/drawing/2014/chartex" xmlns:cx1="http://schemas.microsoft.com/office/drawing/2015/9/8/chartex" xmlns:cx2="http://schemas.microsoft.com/office/drawing/2015/10/21/chartex" xmlns:cx3="http://schemas.microsoft.com/office/drawing/2016/5/9/chartex" xmlns:cx4="http://schemas.microsoft.com/office/drawing/2016/5/10/chartex" xmlns:cx5="http://schemas.microsoft.com/office/drawing/2016/5/11/chartex" xmlns:cx6="http://schemas.microsoft.com/office/drawing/2016/5/12/chartex" xmlns:cx7="http://schemas.microsoft.com/office/drawing/2016/5/13/chartex" xmlns:cx8="http://schemas.microsoft.com/office/drawing/2016/5/14/chartex" xmlns:mc="http://schemas.openxmlformats.org/markup-compatibility/2006" xmlns:aink="http://schemas.microsoft.com/office/drawing/2016/ink" xmlns:am3d="http://schemas.microsoft.com/office/drawing/2017/model3d" xmlns:o="urn:schemas-microsoft-com:office:office" xmlns:r="http://schemas.openxmlformats.org/officeDocument/2006/relationships" xmlns:m="http://schemas.openxmlformats.org/officeDocument/2006/math" xmlns:v="urn:schemas-microsoft-com:vml" xmlns:wp14="http://schemas.microsoft.com/office/word/2010/wordprocessingDrawing" xmlns:wp="http://schemas.openxmlformats.org/drawingml/2006/wordprocessingDrawing" xmlns:w10="urn:schemas-microsoft-com:office:word" xmlns:w="http://schemas.openxmlformats.org/wordprocessingml/2006/main" xmlns:w14="http://schemas.microsoft.com/office/word/2010/wordml" xmlns:w15="http://schemas.microsoft.com/office/word/2012/wordml" xmlns:w16cex="http://schemas.microsoft.com/office/word/2018/wordml/cex" xmlns:w16cid="http://schemas.microsoft.com/office/word/2016/wordml/cid" xmlns:w16="http://schemas.microsoft.com/office/word/2018/wordml" xmlns:w16sdtdh="http://schemas.microsoft.com/office/word/2020/wordml/sdtdatahash" xmlns:w16se="http://schemas.microsoft.com/office/word/2015/wordml/symex" xmlns:wpg="http://schemas.microsoft.com/office/word/2010/wordprocessingGroup" xmlns:wpi="http://schemas.microsoft.com/office/word/2010/wordprocessingInk" xmlns:wne="http://schemas.microsoft.com/office/word/2006/wordml" xmlns:wps="http://schemas.microsoft.com/office/word/2010/wordprocessingShape" mc:Ignorable="w14 w15 w16se w16cid w16 w16cex w16sdtdh wp14">
+<w:endnotes xmlns:wpc="http://schemas.microsoft.com/office/word/2010/wordprocessingCanvas" xmlns:cx="http://schemas.microsoft.com/office/drawing/2014/chartex" xmlns:cx1="http://schemas.microsoft.com/office/drawing/2015/9/8/chartex" xmlns:cx2="http://schemas.microsoft.com/office/drawing/2015/10/21/chartex" xmlns:cx3="http://schemas.microsoft.com/office/drawing/2016/5/9/chartex" xmlns:cx4="http://schemas.microsoft.com/office/drawing/2016/5/10/chartex" xmlns:cx5="http://schemas.microsoft.com/office/drawing/2016/5/11/chartex" xmlns:cx6="http://schemas.microsoft.com/office/drawing/2016/5/12/chartex" xmlns:cx7="http://schemas.microsoft.com/office/drawing/2016/5/13/chartex" xmlns:cx8="http://schemas.microsoft.com/office/drawing/2016/5/14/chartex" xmlns:mc="http://schemas.openxmlformats.org/markup-compatibility/2006" xmlns:aink="http://schemas.microsoft.com/office/drawing/2016/ink" xmlns:am3d="http://schemas.microsoft.com/office/drawing/2017/model3d" xmlns:o="urn:schemas-microsoft-com:office:office" xmlns:oel="http://schemas.microsoft.com/office/2019/extlst" xmlns:r="http://schemas.openxmlformats.org/officeDocument/2006/relationships" xmlns:m="http://schemas.openxmlformats.org/officeDocument/2006/math" xmlns:v="urn:schemas-microsoft-com:vml" xmlns:wp14="http://schemas.microsoft.com/office/word/2010/wordprocessingDrawing" xmlns:wp="http://schemas.openxmlformats.org/drawingml/2006/wordprocessingDrawing" xmlns:w10="urn:schemas-microsoft-com:office:word" xmlns:w="http://schemas.openxmlformats.org/wordprocessingml/2006/main" xmlns:w14="http://schemas.microsoft.com/office/word/2010/wordml" xmlns:w15="http://schemas.microsoft.com/office/word/2012/wordml" xmlns:w16cex="http://schemas.microsoft.com/office/word/2018/wordml/cex" xmlns:w16cid="http://schemas.microsoft.com/office/word/2016/wordml/cid" xmlns:w16="http://schemas.microsoft.com/office/word/2018/wordml" xmlns:w16du="http://schemas.microsoft.com/office/word/2023/wordml/word16du" xmlns:w16sdtdh="http://schemas.microsoft.com/office/word/2020/wordml/sdtdatahash" xmlns:w16sdtfl="http://schemas.microsoft.com/office/word/2024/wordml/sdtformatlock" xmlns:w16se="http://schemas.microsoft.com/office/word/2015/wordml/symex" xmlns:wpg="http://schemas.microsoft.com/office/word/2010/wordprocessingGroup" xmlns:wpi="http://schemas.microsoft.com/office/word/2010/wordprocessingInk" xmlns:wne="http://schemas.microsoft.com/office/word/2006/wordml" xmlns:wps="http://schemas.microsoft.com/office/word/2010/wordprocessingShape" mc:Ignorable="w14 w15 w16se w16cid w16 w16cex w16sdtdh w16sdtfl w16du wp14">
   <w:endnote w:type="separator" w:id="-1">
     <w:p>
       <w:pPr>
@@ -2721,7 +3131,7 @@
 </file>
 
 <file path=word/footnotes.xml><?xml version="1.0" encoding="utf-8"?>
-<w:footnotes xmlns:wpc="http://schemas.microsoft.com/office/word/2010/wordprocessingCanvas" xmlns:cx="http://schemas.microsoft.com/office/drawing/2014/chartex" xmlns:cx1="http://schemas.microsoft.com/office/drawing/2015/9/8/chartex" xmlns:cx2="http://schemas.microsoft.com/office/drawing/2015/10/21/chartex" xmlns:cx3="http://schemas.microsoft.com/office/drawing/2016/5/9/chartex" xmlns:cx4="http://schemas.microsoft.com/office/drawing/2016/5/10/chartex" xmlns:cx5="http://schemas.microsoft.com/office/drawing/2016/5/11/chartex" xmlns:cx6="http://schemas.microsoft.com/office/drawing/2016/5/12/chartex" xmlns:cx7="http://schemas.microsoft.com/office/drawing/2016/5/13/chartex" xmlns:cx8="http://schemas.microsoft.com/office/drawing/2016/5/14/chartex" xmlns:mc="http://schemas.openxmlformats.org/markup-compatibility/2006" xmlns:aink="http://schemas.microsoft.com/office/drawing/2016/ink" xmlns:am3d="http://schemas.microsoft.com/office/drawing/2017/model3d" xmlns:o="urn:schemas-microsoft-com:office:office" xmlns:r="http://schemas.openxmlformats.org/officeDocument/2006/relationships" xmlns:m="http://schemas.openxmlformats.org/officeDocument/2006/math" xmlns:v="urn:schemas-microsoft-com:vml" xmlns:wp14="http://schemas.microsoft.com/office/word/2010/wordprocessingDrawing" xmlns:wp="http://schemas.openxmlformats.org/drawingml/2006/wordprocessingDrawing" xmlns:w10="urn:schemas-microsoft-com:office:word" xmlns:w="http://schemas.openxmlformats.org/wordprocessingml/2006/main" xmlns:w14="http://schemas.microsoft.com/office/word/2010/wordml" xmlns:w15="http://schemas.microsoft.com/office/word/2012/wordml" xmlns:w16cex="http://schemas.microsoft.com/office/word/2018/wordml/cex" xmlns:w16cid="http://schemas.microsoft.com/office/word/2016/wordml/cid" xmlns:w16="http://schemas.microsoft.com/office/word/2018/wordml" xmlns:w16sdtdh="http://schemas.microsoft.com/office/word/2020/wordml/sdtdatahash" xmlns:w16se="http://schemas.microsoft.com/office/word/2015/wordml/symex" xmlns:wpg="http://schemas.microsoft.com/office/word/2010/wordprocessingGroup" xmlns:wpi="http://schemas.microsoft.com/office/word/2010/wordprocessingInk" xmlns:wne="http://schemas.microsoft.com/office/word/2006/wordml" xmlns:wps="http://schemas.microsoft.com/office/word/2010/wordprocessingShape" mc:Ignorable="w14 w15 w16se w16cid w16 w16cex w16sdtdh wp14">
+<w:footnotes xmlns:wpc="http://schemas.microsoft.com/office/word/2010/wordprocessingCanvas" xmlns:cx="http://schemas.microsoft.com/office/drawing/2014/chartex" xmlns:cx1="http://schemas.microsoft.com/office/drawing/2015/9/8/chartex" xmlns:cx2="http://schemas.microsoft.com/office/drawing/2015/10/21/chartex" xmlns:cx3="http://schemas.microsoft.com/office/drawing/2016/5/9/chartex" xmlns:cx4="http://schemas.microsoft.com/office/drawing/2016/5/10/chartex" xmlns:cx5="http://schemas.microsoft.com/office/drawing/2016/5/11/chartex" xmlns:cx6="http://schemas.microsoft.com/office/drawing/2016/5/12/chartex" xmlns:cx7="http://schemas.microsoft.com/office/drawing/2016/5/13/chartex" xmlns:cx8="http://schemas.microsoft.com/office/drawing/2016/5/14/chartex" xmlns:mc="http://schemas.openxmlformats.org/markup-compatibility/2006" xmlns:aink="http://schemas.microsoft.com/office/drawing/2016/ink" xmlns:am3d="http://schemas.microsoft.com/office/drawing/2017/model3d" xmlns:o="urn:schemas-microsoft-com:office:office" xmlns:oel="http://schemas.microsoft.com/office/2019/extlst" xmlns:r="http://schemas.openxmlformats.org/officeDocument/2006/relationships" xmlns:m="http://schemas.openxmlformats.org/officeDocument/2006/math" xmlns:v="urn:schemas-microsoft-com:vml" xmlns:wp14="http://schemas.microsoft.com/office/word/2010/wordprocessingDrawing" xmlns:wp="http://schemas.openxmlformats.org/drawingml/2006/wordprocessingDrawing" xmlns:w10="urn:schemas-microsoft-com:office:word" xmlns:w="http://schemas.openxmlformats.org/wordprocessingml/2006/main" xmlns:w14="http://schemas.microsoft.com/office/word/2010/wordml" xmlns:w15="http://schemas.microsoft.com/office/word/2012/wordml" xmlns:w16cex="http://schemas.microsoft.com/office/word/2018/wordml/cex" xmlns:w16cid="http://schemas.microsoft.com/office/word/2016/wordml/cid" xmlns:w16="http://schemas.microsoft.com/office/word/2018/wordml" xmlns:w16du="http://schemas.microsoft.com/office/word/2023/wordml/word16du" xmlns:w16sdtdh="http://schemas.microsoft.com/office/word/2020/wordml/sdtdatahash" xmlns:w16sdtfl="http://schemas.microsoft.com/office/word/2024/wordml/sdtformatlock" xmlns:w16se="http://schemas.microsoft.com/office/word/2015/wordml/symex" xmlns:wpg="http://schemas.microsoft.com/office/word/2010/wordprocessingGroup" xmlns:wpi="http://schemas.microsoft.com/office/word/2010/wordprocessingInk" xmlns:wne="http://schemas.microsoft.com/office/word/2006/wordml" xmlns:wps="http://schemas.microsoft.com/office/word/2010/wordprocessingShape" mc:Ignorable="w14 w15 w16se w16cid w16 w16cex w16sdtdh w16sdtfl w16du wp14">
   <w:footnote w:type="separator" w:id="-1">
     <w:p>
       <w:pPr>
@@ -2746,7 +3156,7 @@
 </file>
 
 <file path=word/numbering.xml><?xml version="1.0" encoding="utf-8"?>
-<w:numbering xmlns:wpc="http://schemas.microsoft.com/office/word/2010/wordprocessingCanvas" xmlns:cx="http://schemas.microsoft.com/office/drawing/2014/chartex" xmlns:cx1="http://schemas.microsoft.com/office/drawing/2015/9/8/chartex" xmlns:cx2="http://schemas.microsoft.com/office/drawing/2015/10/21/chartex" xmlns:cx3="http://schemas.microsoft.com/office/drawing/2016/5/9/chartex" xmlns:cx4="http://schemas.microsoft.com/office/drawing/2016/5/10/chartex" xmlns:cx5="http://schemas.microsoft.com/office/drawing/2016/5/11/chartex" xmlns:cx6="http://schemas.microsoft.com/office/drawing/2016/5/12/chartex" xmlns:cx7="http://schemas.microsoft.com/office/drawing/2016/5/13/chartex" xmlns:cx8="http://schemas.microsoft.com/office/drawing/2016/5/14/chartex" xmlns:mc="http://schemas.openxmlformats.org/markup-compatibility/2006" xmlns:aink="http://schemas.microsoft.com/office/drawing/2016/ink" xmlns:am3d="http://schemas.microsoft.com/office/drawing/2017/model3d" xmlns:o="urn:schemas-microsoft-com:office:office" xmlns:r="http://schemas.openxmlformats.org/officeDocument/2006/relationships" xmlns:m="http://schemas.openxmlformats.org/officeDocument/2006/math" xmlns:v="urn:schemas-microsoft-com:vml" xmlns:wp14="http://schemas.microsoft.com/office/word/2010/wordprocessingDrawing" xmlns:wp="http://schemas.openxmlformats.org/drawingml/2006/wordprocessingDrawing" xmlns:w10="urn:schemas-microsoft-com:office:word" xmlns:w="http://schemas.openxmlformats.org/wordprocessingml/2006/main" xmlns:w14="http://schemas.microsoft.com/office/word/2010/wordml" xmlns:w15="http://schemas.microsoft.com/office/word/2012/wordml" xmlns:w16cex="http://schemas.microsoft.com/office/word/2018/wordml/cex" xmlns:w16cid="http://schemas.microsoft.com/office/word/2016/wordml/cid" xmlns:w16="http://schemas.microsoft.com/office/word/2018/wordml" xmlns:w16sdtdh="http://schemas.microsoft.com/office/word/2020/wordml/sdtdatahash" xmlns:w16se="http://schemas.microsoft.com/office/word/2015/wordml/symex" xmlns:wpg="http://schemas.microsoft.com/office/word/2010/wordprocessingGroup" xmlns:wpi="http://schemas.microsoft.com/office/word/2010/wordprocessingInk" xmlns:wne="http://schemas.microsoft.com/office/word/2006/wordml" xmlns:wps="http://schemas.microsoft.com/office/word/2010/wordprocessingShape" mc:Ignorable="w14 w15 w16se w16cid w16 w16cex w16sdtdh wp14">
+<w:numbering xmlns:wpc="http://schemas.microsoft.com/office/word/2010/wordprocessingCanvas" xmlns:cx="http://schemas.microsoft.com/office/drawing/2014/chartex" xmlns:cx1="http://schemas.microsoft.com/office/drawing/2015/9/8/chartex" xmlns:cx2="http://schemas.microsoft.com/office/drawing/2015/10/21/chartex" xmlns:cx3="http://schemas.microsoft.com/office/drawing/2016/5/9/chartex" xmlns:cx4="http://schemas.microsoft.com/office/drawing/2016/5/10/chartex" xmlns:cx5="http://schemas.microsoft.com/office/drawing/2016/5/11/chartex" xmlns:cx6="http://schemas.microsoft.com/office/drawing/2016/5/12/chartex" xmlns:cx7="http://schemas.microsoft.com/office/drawing/2016/5/13/chartex" xmlns:cx8="http://schemas.microsoft.com/office/drawing/2016/5/14/chartex" xmlns:mc="http://schemas.openxmlformats.org/markup-compatibility/2006" xmlns:aink="http://schemas.microsoft.com/office/drawing/2016/ink" xmlns:am3d="http://schemas.microsoft.com/office/drawing/2017/model3d" xmlns:o="urn:schemas-microsoft-com:office:office" xmlns:oel="http://schemas.microsoft.com/office/2019/extlst" xmlns:r="http://schemas.openxmlformats.org/officeDocument/2006/relationships" xmlns:m="http://schemas.openxmlformats.org/officeDocument/2006/math" xmlns:v="urn:schemas-microsoft-com:vml" xmlns:wp14="http://schemas.microsoft.com/office/word/2010/wordprocessingDrawing" xmlns:wp="http://schemas.openxmlformats.org/drawingml/2006/wordprocessingDrawing" xmlns:w10="urn:schemas-microsoft-com:office:word" xmlns:w="http://schemas.openxmlformats.org/wordprocessingml/2006/main" xmlns:w14="http://schemas.microsoft.com/office/word/2010/wordml" xmlns:w15="http://schemas.microsoft.com/office/word/2012/wordml" xmlns:w16cex="http://schemas.microsoft.com/office/word/2018/wordml/cex" xmlns:w16cid="http://schemas.microsoft.com/office/word/2016/wordml/cid" xmlns:w16="http://schemas.microsoft.com/office/word/2018/wordml" xmlns:w16du="http://schemas.microsoft.com/office/word/2023/wordml/word16du" xmlns:w16sdtdh="http://schemas.microsoft.com/office/word/2020/wordml/sdtdatahash" xmlns:w16sdtfl="http://schemas.microsoft.com/office/word/2024/wordml/sdtformatlock" xmlns:w16se="http://schemas.microsoft.com/office/word/2015/wordml/symex" xmlns:wpg="http://schemas.microsoft.com/office/word/2010/wordprocessingGroup" xmlns:wpi="http://schemas.microsoft.com/office/word/2010/wordprocessingInk" xmlns:wne="http://schemas.microsoft.com/office/word/2006/wordml" xmlns:wps="http://schemas.microsoft.com/office/word/2010/wordprocessingShape" mc:Ignorable="w14 w15 w16se w16cid w16 w16cex w16sdtdh w16sdtfl w16du wp14">
   <w:abstractNum w:abstractNumId="0" w15:restartNumberingAfterBreak="0">
     <w:nsid w:val="219A4FDF"/>
     <w:multiLevelType w:val="hybridMultilevel"/>
@@ -3054,74 +3464,74 @@
       </w:rPr>
     </w:lvl>
   </w:abstractNum>
-  <w:num w:numId="1">
+  <w:num w:numId="1" w16cid:durableId="2029985990">
     <w:abstractNumId w:val="0"/>
     <w:lvlOverride w:ilvl="0">
       <w:startOverride w:val="1"/>
     </w:lvlOverride>
   </w:num>
-  <w:num w:numId="2">
+  <w:num w:numId="2" w16cid:durableId="391390500">
     <w:abstractNumId w:val="1"/>
     <w:lvlOverride w:ilvl="0">
       <w:startOverride w:val="1"/>
     </w:lvlOverride>
   </w:num>
-  <w:num w:numId="3">
+  <w:num w:numId="3" w16cid:durableId="814640411">
     <w:abstractNumId w:val="1"/>
     <w:lvlOverride w:ilvl="0">
       <w:startOverride w:val="1"/>
     </w:lvlOverride>
   </w:num>
-  <w:num w:numId="4">
+  <w:num w:numId="4" w16cid:durableId="1899048139">
     <w:abstractNumId w:val="1"/>
     <w:lvlOverride w:ilvl="0">
       <w:startOverride w:val="1"/>
     </w:lvlOverride>
   </w:num>
-  <w:num w:numId="5">
+  <w:num w:numId="5" w16cid:durableId="287131231">
     <w:abstractNumId w:val="1"/>
     <w:lvlOverride w:ilvl="0">
       <w:startOverride w:val="1"/>
     </w:lvlOverride>
   </w:num>
-  <w:num w:numId="6">
+  <w:num w:numId="6" w16cid:durableId="1932660756">
     <w:abstractNumId w:val="1"/>
     <w:lvlOverride w:ilvl="0">
       <w:startOverride w:val="1"/>
     </w:lvlOverride>
   </w:num>
-  <w:num w:numId="7">
+  <w:num w:numId="7" w16cid:durableId="1041319403">
     <w:abstractNumId w:val="1"/>
     <w:lvlOverride w:ilvl="0">
       <w:startOverride w:val="1"/>
     </w:lvlOverride>
   </w:num>
-  <w:num w:numId="8">
+  <w:num w:numId="8" w16cid:durableId="1962807368">
     <w:abstractNumId w:val="1"/>
     <w:lvlOverride w:ilvl="0">
       <w:startOverride w:val="1"/>
     </w:lvlOverride>
   </w:num>
-  <w:num w:numId="9">
+  <w:num w:numId="9" w16cid:durableId="1488135751">
     <w:abstractNumId w:val="1"/>
     <w:lvlOverride w:ilvl="0">
       <w:startOverride w:val="1"/>
     </w:lvlOverride>
   </w:num>
-  <w:num w:numId="10">
+  <w:num w:numId="10" w16cid:durableId="1916937689">
     <w:abstractNumId w:val="1"/>
     <w:lvlOverride w:ilvl="0">
       <w:startOverride w:val="1"/>
     </w:lvlOverride>
   </w:num>
-  <w:num w:numId="11">
+  <w:num w:numId="11" w16cid:durableId="1669745450">
     <w:abstractNumId w:val="3"/>
   </w:num>
 </w:numbering>
 </file>
 
 <file path=word/styles.xml><?xml version="1.0" encoding="utf-8"?>
-<w:styles xmlns:mc="http://schemas.openxmlformats.org/markup-compatibility/2006" xmlns:r="http://schemas.openxmlformats.org/officeDocument/2006/relationships" xmlns:w="http://schemas.openxmlformats.org/wordprocessingml/2006/main" xmlns:w14="http://schemas.microsoft.com/office/word/2010/wordml" xmlns:w15="http://schemas.microsoft.com/office/word/2012/wordml" xmlns:w16cex="http://schemas.microsoft.com/office/word/2018/wordml/cex" xmlns:w16cid="http://schemas.microsoft.com/office/word/2016/wordml/cid" xmlns:w16="http://schemas.microsoft.com/office/word/2018/wordml" xmlns:w16sdtdh="http://schemas.microsoft.com/office/word/2020/wordml/sdtdatahash" xmlns:w16se="http://schemas.microsoft.com/office/word/2015/wordml/symex" mc:Ignorable="w14 w15 w16se w16cid w16 w16cex w16sdtdh">
+<w:styles xmlns:mc="http://schemas.openxmlformats.org/markup-compatibility/2006" xmlns:r="http://schemas.openxmlformats.org/officeDocument/2006/relationships" xmlns:w="http://schemas.openxmlformats.org/wordprocessingml/2006/main" xmlns:w14="http://schemas.microsoft.com/office/word/2010/wordml" xmlns:w15="http://schemas.microsoft.com/office/word/2012/wordml" xmlns:w16cex="http://schemas.microsoft.com/office/word/2018/wordml/cex" xmlns:w16cid="http://schemas.microsoft.com/office/word/2016/wordml/cid" xmlns:w16="http://schemas.microsoft.com/office/word/2018/wordml" xmlns:w16du="http://schemas.microsoft.com/office/word/2023/wordml/word16du" xmlns:w16sdtdh="http://schemas.microsoft.com/office/word/2020/wordml/sdtdatahash" xmlns:w16sdtfl="http://schemas.microsoft.com/office/word/2024/wordml/sdtformatlock" xmlns:w16se="http://schemas.microsoft.com/office/word/2015/wordml/symex" mc:Ignorable="w14 w15 w16se w16cid w16 w16cex w16sdtdh w16sdtfl w16du">
   <w:docDefaults>
     <w:rPrDefault>
       <w:rPr>

</xml_diff>